<commit_message>
feat: add self-contained HEART AI chatbot (replaces n8n dependency)
- Add /heart-ai page with premium dark-themed chat UI
- Add OpenAI function-calling workflow replicating n8n HEART-Workflow
- Parse local data files (MasterSheet, PredictionText, Tweets, SourceOfTruth)
- Add /api/heart-chat API route with conversation history
- Update landing page navigation with HEART AI link
- Install mammoth for .docx parsing
</commit_message>
<xml_diff>
--- a/data/HEART Score Economic Model – SourceofTruth.docx
+++ b/data/HEART Score Economic Model – SourceofTruth.docx
@@ -2420,23 +2420,7 @@
         <w:ind w:left="720"/>
       </w:pPr>
       <w:r>
-        <w:t xml:space="preserve">To conclude, Argentina is a mid-sized global economy with strong social indicators but severely weakened by high inflation, heavy debt, and low affordability for its citizens. Argentina needs to enhance its economic growth faster than the population growth, concentrate more on governance, turn the country into a lean economy to overcome inflation, tighten monetary policy to have price stability without comprising further erosion of fiscal anchor, besides, expanding export base. These are some of the </w:t>
-      </w:r>
-      <w:proofErr w:type="gramStart"/>
-      <w:r>
-        <w:t>HEART</w:t>
-      </w:r>
-      <w:proofErr w:type="gramEnd"/>
-      <w:r>
-        <w:t xml:space="preserve"> suggested measures which need to be taken in the </w:t>
-      </w:r>
-      <w:proofErr w:type="gramStart"/>
-      <w:r>
-        <w:t>medium to</w:t>
-      </w:r>
-      <w:proofErr w:type="gramEnd"/>
-      <w:r>
-        <w:t xml:space="preserve"> long term to improve economic situation of the country.</w:t>
+        <w:t>To conclude, Argentina is a mid-sized global economy with strong social indicators but severely weakened by high inflation, heavy debt, and low affordability for its citizens. Argentina needs to enhance its economic growth faster than the population growth, concentrate more on governance, turn the country into a lean economy to overcome inflation, tighten monetary policy to have price stability without comprising further erosion of fiscal anchor, besides, expanding export base. These are some of the HEART suggested measures which need to be taken in the medium to long term to improve economic situation of the country.</w:t>
       </w:r>
     </w:p>
     <w:p>
@@ -2460,14 +2444,7 @@
           <w:b/>
           <w:bCs/>
         </w:rPr>
-        <w:t>South Africa</w:t>
-      </w:r>
-      <w:r>
-        <w:rPr>
-          <w:b/>
-          <w:bCs/>
-        </w:rPr>
-        <w:t xml:space="preserve"> - </w:t>
+        <w:t xml:space="preserve">South Africa - </w:t>
       </w:r>
       <w:r>
         <w:rPr>
@@ -2478,7 +2455,7 @@
           <w:szCs w:val="22"/>
           <w:shd w:val="clear" w:color="auto" w:fill="FFFFFF"/>
         </w:rPr>
-        <w:t>0.40D-</w:t>
+        <w:t>0.40D-:</w:t>
       </w:r>
       <w:r>
         <w:rPr>
@@ -2489,79 +2466,78 @@
           <w:szCs w:val="22"/>
           <w:shd w:val="clear" w:color="auto" w:fill="FFFFFF"/>
         </w:rPr>
-        <w:t>:</w:t>
-      </w:r>
-      <w:r>
-        <w:rPr>
-          <w:b/>
-          <w:bCs/>
+        <w:t xml:space="preserve"> </w:t>
+      </w:r>
+      <w:r>
+        <w:rPr>
           <w:color w:val="000000"/>
           <w:sz w:val="22"/>
           <w:szCs w:val="22"/>
           <w:shd w:val="clear" w:color="auto" w:fill="FFFFFF"/>
         </w:rPr>
-        <w:t xml:space="preserve"> </w:t>
-      </w:r>
-      <w:r>
+        <w:t>Heart Value: 0.40 | Heart Affordability Value: $707.81+| Heart Affordability Ranking: D- → Heart Score: 0.40D-</w:t>
+      </w:r>
+    </w:p>
+    <w:p>
+      <w:pPr>
+        <w:pStyle w:val="ListParagraph"/>
         <w:rPr>
           <w:color w:val="000000"/>
           <w:sz w:val="22"/>
           <w:szCs w:val="22"/>
           <w:shd w:val="clear" w:color="auto" w:fill="FFFFFF"/>
         </w:rPr>
-        <w:t>Heart Value: 0.40 | Heart Affordability Value: $707.81+| Heart Affordability Ranking: D- → Heart Score: 0.40D-</w:t>
-      </w:r>
-    </w:p>
-    <w:p>
-      <w:pPr>
-        <w:pStyle w:val="ListParagraph"/>
+      </w:pPr>
+      <w:r>
         <w:rPr>
           <w:color w:val="000000"/>
           <w:sz w:val="22"/>
           <w:szCs w:val="22"/>
           <w:shd w:val="clear" w:color="auto" w:fill="FFFFFF"/>
         </w:rPr>
-      </w:pPr>
-      <w:r>
+        <w:t>Heart Performance in terms of Economic Resilience: Satisfactory</w:t>
+      </w:r>
+    </w:p>
+    <w:p>
+      <w:pPr>
+        <w:pStyle w:val="ListParagraph"/>
         <w:rPr>
           <w:color w:val="000000"/>
           <w:sz w:val="22"/>
           <w:szCs w:val="22"/>
           <w:shd w:val="clear" w:color="auto" w:fill="FFFFFF"/>
         </w:rPr>
-        <w:t>Heart Performance in terms of Economic Resilience: Satisfactory</w:t>
-      </w:r>
-    </w:p>
-    <w:p>
-      <w:pPr>
-        <w:pStyle w:val="ListParagraph"/>
+      </w:pPr>
+      <w:r>
         <w:rPr>
           <w:color w:val="000000"/>
           <w:sz w:val="22"/>
           <w:szCs w:val="22"/>
           <w:shd w:val="clear" w:color="auto" w:fill="FFFFFF"/>
         </w:rPr>
-      </w:pPr>
-      <w:r>
+        <w:t>Heart Performance in terms of Affordability: Very Weak</w:t>
+      </w:r>
+    </w:p>
+    <w:p>
+      <w:pPr>
+        <w:pStyle w:val="ListParagraph"/>
         <w:rPr>
           <w:color w:val="000000"/>
           <w:sz w:val="22"/>
           <w:szCs w:val="22"/>
           <w:shd w:val="clear" w:color="auto" w:fill="FFFFFF"/>
         </w:rPr>
-        <w:t>Heart Performance in terms of Affordability: Very Weak</w:t>
-      </w:r>
-    </w:p>
-    <w:p>
-      <w:pPr>
-        <w:pStyle w:val="ListParagraph"/>
+      </w:pPr>
+      <w:r>
         <w:rPr>
           <w:color w:val="000000"/>
           <w:sz w:val="22"/>
           <w:szCs w:val="22"/>
           <w:shd w:val="clear" w:color="auto" w:fill="FFFFFF"/>
         </w:rPr>
-      </w:pPr>
+        <w:t xml:space="preserve">South Africa currently has the largest economy in Africa. The country is a permanent member of G-20 and recently hosted annual G-20 summit in Johannesburg. South Africa is a mid-sized global economy with over $426 </w:t>
+      </w:r>
+      <w:proofErr w:type="spellStart"/>
       <w:r>
         <w:rPr>
           <w:color w:val="000000"/>
@@ -2569,9 +2545,9 @@
           <w:szCs w:val="22"/>
           <w:shd w:val="clear" w:color="auto" w:fill="FFFFFF"/>
         </w:rPr>
-        <w:t xml:space="preserve">South Africa currently has the largest economy in Africa. The country is a permanent member of G-20 and recently hosted annual G-20 summit in Johannesburg. South Africa is a mid-sized global economy with over $426 </w:t>
-      </w:r>
-      <w:proofErr w:type="spellStart"/>
+        <w:t>billions</w:t>
+      </w:r>
+      <w:proofErr w:type="spellEnd"/>
       <w:r>
         <w:rPr>
           <w:color w:val="000000"/>
@@ -2579,49 +2555,49 @@
           <w:szCs w:val="22"/>
           <w:shd w:val="clear" w:color="auto" w:fill="FFFFFF"/>
         </w:rPr>
-        <w:t>billions</w:t>
-      </w:r>
-      <w:proofErr w:type="spellEnd"/>
-      <w:r>
+        <w:t xml:space="preserve"> of GDP nominal representing 0.37% of the global economy also reflecting a relatively small but regionally influential economic presence.</w:t>
+      </w:r>
+    </w:p>
+    <w:p>
+      <w:pPr>
+        <w:pStyle w:val="ListParagraph"/>
         <w:rPr>
           <w:color w:val="000000"/>
           <w:sz w:val="22"/>
           <w:szCs w:val="22"/>
           <w:shd w:val="clear" w:color="auto" w:fill="FFFFFF"/>
         </w:rPr>
-        <w:t xml:space="preserve"> of GDP nominal representing 0.37% of the global economy also reflecting a relatively small but regionally influential economic presence.</w:t>
-      </w:r>
-    </w:p>
-    <w:p>
-      <w:pPr>
-        <w:pStyle w:val="ListParagraph"/>
+      </w:pPr>
+      <w:r>
         <w:rPr>
           <w:color w:val="000000"/>
           <w:sz w:val="22"/>
           <w:szCs w:val="22"/>
           <w:shd w:val="clear" w:color="auto" w:fill="FFFFFF"/>
         </w:rPr>
-      </w:pPr>
-      <w:r>
+        <w:t>With a population of 63 million, South Africa represents 0.78% of the world’s 8.184 billion people. Despite its population size, income levels remain moderate, with a Per Capita Income (PCI) of $6,661.15. However, after adjusting for inflation and purchasing conditions, the Adjusted PCI (APCI) falls to $6,434.67, signaling limited real purchasing power for the average citizens.</w:t>
+      </w:r>
+    </w:p>
+    <w:p>
+      <w:pPr>
+        <w:pStyle w:val="ListParagraph"/>
         <w:rPr>
           <w:color w:val="000000"/>
           <w:sz w:val="22"/>
           <w:szCs w:val="22"/>
           <w:shd w:val="clear" w:color="auto" w:fill="FFFFFF"/>
         </w:rPr>
-        <w:t>With a population of 63 million, South Africa represents 0.78% of the world’s 8.184 billion people. Despite its population size, income levels remain moderate, with a Per Capita Income (PCI) of $6,661.15. However, after adjusting for inflation and purchasing conditions, the Adjusted PCI (APCI) falls to $6,434.67, signaling limited real purchasing power for the average citizens.</w:t>
-      </w:r>
-    </w:p>
-    <w:p>
-      <w:pPr>
-        <w:pStyle w:val="ListParagraph"/>
+      </w:pPr>
+      <w:r>
         <w:rPr>
           <w:color w:val="000000"/>
           <w:sz w:val="22"/>
           <w:szCs w:val="22"/>
           <w:shd w:val="clear" w:color="auto" w:fill="FFFFFF"/>
         </w:rPr>
-      </w:pPr>
+        <w:t xml:space="preserve">Inflation is comparatively stable at 3.4%, and interest rates at 6.75% reflect moderate borrowing costs. South Africa’s total debt stands at over $355 billion after adjustments. Interest payments </w:t>
+      </w:r>
+      <w:proofErr w:type="gramStart"/>
       <w:r>
         <w:rPr>
           <w:color w:val="000000"/>
@@ -2629,9 +2605,9 @@
           <w:szCs w:val="22"/>
           <w:shd w:val="clear" w:color="auto" w:fill="FFFFFF"/>
         </w:rPr>
-        <w:t xml:space="preserve">Inflation is comparatively stable at 3.4%, and interest rates at 6.75% reflect moderate borrowing costs. South Africa’s total debt stands at over $355 billion after adjustments. Interest payments </w:t>
-      </w:r>
-      <w:proofErr w:type="gramStart"/>
+        <w:t>absorbing</w:t>
+      </w:r>
+      <w:proofErr w:type="gramEnd"/>
       <w:r>
         <w:rPr>
           <w:color w:val="000000"/>
@@ -2639,29 +2615,30 @@
           <w:szCs w:val="22"/>
           <w:shd w:val="clear" w:color="auto" w:fill="FFFFFF"/>
         </w:rPr>
-        <w:t>absorbing</w:t>
-      </w:r>
-      <w:proofErr w:type="gramEnd"/>
-      <w:r>
+        <w:t xml:space="preserve"> 5.26% of GDP. The Adjusted Debt-to-GDP ratio is comparatively high at 83.26%, indicating a heavy fiscal burden and long-term debt sustainability concerns.</w:t>
+      </w:r>
+    </w:p>
+    <w:p>
+      <w:pPr>
+        <w:pStyle w:val="ListParagraph"/>
         <w:rPr>
           <w:color w:val="000000"/>
           <w:sz w:val="22"/>
           <w:szCs w:val="22"/>
           <w:shd w:val="clear" w:color="auto" w:fill="FFFFFF"/>
         </w:rPr>
-        <w:t xml:space="preserve"> 5.26% of GDP. The Adjusted Debt-to-GDP ratio is comparatively high at 83.26%, indicating a heavy fiscal burden and long-term debt sustainability concerns.</w:t>
-      </w:r>
-    </w:p>
-    <w:p>
-      <w:pPr>
-        <w:pStyle w:val="ListParagraph"/>
+      </w:pPr>
+      <w:r>
         <w:rPr>
           <w:color w:val="000000"/>
           <w:sz w:val="22"/>
           <w:szCs w:val="22"/>
           <w:shd w:val="clear" w:color="auto" w:fill="FFFFFF"/>
         </w:rPr>
-      </w:pPr>
+        <w:t xml:space="preserve">In global trade, South Africa contributes 0.41% of the total global </w:t>
+      </w:r>
+      <w:proofErr w:type="spellStart"/>
+      <w:proofErr w:type="gramStart"/>
       <w:r>
         <w:rPr>
           <w:color w:val="000000"/>
@@ -2669,10 +2646,10 @@
           <w:szCs w:val="22"/>
           <w:shd w:val="clear" w:color="auto" w:fill="FFFFFF"/>
         </w:rPr>
-        <w:t xml:space="preserve">In global trade, South Africa contributes 0.41% of the total global </w:t>
-      </w:r>
-      <w:proofErr w:type="spellStart"/>
-      <w:proofErr w:type="gramStart"/>
+        <w:t>trade.Trade</w:t>
+      </w:r>
+      <w:proofErr w:type="spellEnd"/>
+      <w:proofErr w:type="gramEnd"/>
       <w:r>
         <w:rPr>
           <w:color w:val="000000"/>
@@ -2680,90 +2657,90 @@
           <w:szCs w:val="22"/>
           <w:shd w:val="clear" w:color="auto" w:fill="FFFFFF"/>
         </w:rPr>
-        <w:t>trade.Trade</w:t>
-      </w:r>
-      <w:proofErr w:type="spellEnd"/>
-      <w:proofErr w:type="gramEnd"/>
-      <w:r>
+        <w:t xml:space="preserve"> is a major driver of the economy, accounting for 59.10% of GDP — a very high level for a developing nation. Notably, the country records a positive trade balance of $38 billion, equal to 8.91% of GDP, demonstrating strong export performance relative to imports.</w:t>
+      </w:r>
+    </w:p>
+    <w:p>
+      <w:pPr>
+        <w:pStyle w:val="ListParagraph"/>
         <w:rPr>
           <w:color w:val="000000"/>
           <w:sz w:val="22"/>
           <w:szCs w:val="22"/>
           <w:shd w:val="clear" w:color="auto" w:fill="FFFFFF"/>
         </w:rPr>
-        <w:t xml:space="preserve"> is a major driver of the economy, accounting for 59.10% of GDP — a very high level for a developing nation. Notably, the country records a positive trade balance of $38 billion, equal to 8.91% of GDP, demonstrating strong export performance relative to imports.</w:t>
-      </w:r>
-    </w:p>
-    <w:p>
-      <w:pPr>
-        <w:pStyle w:val="ListParagraph"/>
+      </w:pPr>
+      <w:r>
         <w:rPr>
           <w:color w:val="000000"/>
           <w:sz w:val="22"/>
           <w:szCs w:val="22"/>
           <w:shd w:val="clear" w:color="auto" w:fill="FFFFFF"/>
         </w:rPr>
-      </w:pPr>
-      <w:r>
+        <w:t>According to Heart Score, the four socio-economic segments of South Africa like Housing, Health, Energy and Education combined as Social Determinants contributed 36.46% of the national GDP and thus playing a significant role towards making South Africa economically robust.</w:t>
+      </w:r>
+    </w:p>
+    <w:p>
+      <w:pPr>
+        <w:pStyle w:val="ListParagraph"/>
         <w:rPr>
           <w:color w:val="000000"/>
           <w:sz w:val="22"/>
           <w:szCs w:val="22"/>
           <w:shd w:val="clear" w:color="auto" w:fill="FFFFFF"/>
         </w:rPr>
-        <w:t>According to Heart Score, the four socio-economic segments of South Africa like Housing, Health, Energy and Education combined as Social Determinants contributed 36.46% of the national GDP and thus playing a significant role towards making South Africa economically robust.</w:t>
-      </w:r>
-    </w:p>
-    <w:p>
-      <w:pPr>
-        <w:pStyle w:val="ListParagraph"/>
+      </w:pPr>
+      <w:r>
         <w:rPr>
           <w:color w:val="000000"/>
           <w:sz w:val="22"/>
           <w:szCs w:val="22"/>
           <w:shd w:val="clear" w:color="auto" w:fill="FFFFFF"/>
         </w:rPr>
-      </w:pPr>
-      <w:r>
+        <w:t>South Africa’s Human Development Index (HDI) is 0.741, placing it in the medium-high development range. However, with a GINI coefficient of 0.63 — one of the highest inequality levels globally — the Adjusted HDI (AHDI) drops dramatically to 0.111, showing that inequality sharply undermines real human development outcomes.</w:t>
+      </w:r>
+    </w:p>
+    <w:p>
+      <w:pPr>
+        <w:pStyle w:val="ListParagraph"/>
         <w:rPr>
           <w:color w:val="000000"/>
           <w:sz w:val="22"/>
           <w:szCs w:val="22"/>
           <w:shd w:val="clear" w:color="auto" w:fill="FFFFFF"/>
         </w:rPr>
-        <w:t>South Africa’s Human Development Index (HDI) is 0.741, placing it in the medium-high development range. However, with a GINI coefficient of 0.63 — one of the highest inequality levels globally — the Adjusted HDI (AHDI) drops dramatically to 0.111, showing that inequality sharply undermines real human development outcomes.</w:t>
-      </w:r>
-    </w:p>
-    <w:p>
-      <w:pPr>
-        <w:pStyle w:val="ListParagraph"/>
+      </w:pPr>
+      <w:r>
         <w:rPr>
           <w:color w:val="000000"/>
           <w:sz w:val="22"/>
           <w:szCs w:val="22"/>
           <w:shd w:val="clear" w:color="auto" w:fill="FFFFFF"/>
         </w:rPr>
-      </w:pPr>
-      <w:r>
+        <w:t>The Heart Value (HV) stands at 0.40, reflecting satisfactory level of economic resilience. However, The Heart Affordability Value, calculated through APCI × AHDI, is only $707.81, which is graded D-, indicating severe affordability constraints for citizens. When combined, the final Heart Score is 0.40D-, placing South Africa on the satisfactory level of resilience with acute affordability, and quality-of-life rankings.</w:t>
+      </w:r>
+    </w:p>
+    <w:p>
+      <w:pPr>
+        <w:pStyle w:val="ListParagraph"/>
         <w:rPr>
           <w:color w:val="000000"/>
           <w:sz w:val="22"/>
           <w:szCs w:val="22"/>
           <w:shd w:val="clear" w:color="auto" w:fill="FFFFFF"/>
         </w:rPr>
-        <w:t>The Heart Value (HV) stands at 0.40, reflecting satisfactory level of economic resilience. However, The Heart Affordability Value, calculated through APCI × AHDI, is only $707.81, which is graded D-, indicating severe affordability constraints for citizens. When combined, the final Heart Score is 0.40D-, placing South Africa on the satisfactory level of resilience with acute affordability, and quality-of-life rankings.</w:t>
-      </w:r>
-    </w:p>
-    <w:p>
-      <w:pPr>
-        <w:pStyle w:val="ListParagraph"/>
+      </w:pPr>
+      <w:r>
         <w:rPr>
           <w:color w:val="000000"/>
           <w:sz w:val="22"/>
           <w:szCs w:val="22"/>
           <w:shd w:val="clear" w:color="auto" w:fill="FFFFFF"/>
         </w:rPr>
-      </w:pPr>
+        <w:lastRenderedPageBreak/>
+        <w:t xml:space="preserve">To conclude, South Africa is a mid-sized global economy driven by a strong and sophisticated financial services sector, significant natural resources like minerals and a large manufacturing base. The country, however, </w:t>
+      </w:r>
+      <w:proofErr w:type="gramStart"/>
       <w:r>
         <w:rPr>
           <w:color w:val="000000"/>
@@ -2771,10 +2748,9 @@
           <w:szCs w:val="22"/>
           <w:shd w:val="clear" w:color="auto" w:fill="FFFFFF"/>
         </w:rPr>
-        <w:lastRenderedPageBreak/>
-        <w:t xml:space="preserve">To conclude, South Africa is a mid-sized global economy driven by a strong and sophisticated financial services sector, significant natural resources like minerals and a large manufacturing base. The country, however, </w:t>
-      </w:r>
-      <w:proofErr w:type="gramStart"/>
+        <w:t>severely</w:t>
+      </w:r>
+      <w:proofErr w:type="gramEnd"/>
       <w:r>
         <w:rPr>
           <w:color w:val="000000"/>
@@ -2782,9 +2758,9 @@
           <w:szCs w:val="22"/>
           <w:shd w:val="clear" w:color="auto" w:fill="FFFFFF"/>
         </w:rPr>
-        <w:t>severely</w:t>
-      </w:r>
-      <w:proofErr w:type="gramEnd"/>
+        <w:t xml:space="preserve"> weakened by high inequality which is one of the highest in the world and relatively moderate concentration on all four social segments of HEART: Housing, Health, Energy and Education. This sure indicates that South Africa faces interconnected economic challenges, primarily defined by the “triple challenges” of high unemployment, poverty, and severe inequality. These issues are further compounded by low economic growth and </w:t>
+      </w:r>
+      <w:proofErr w:type="gramStart"/>
       <w:r>
         <w:rPr>
           <w:color w:val="000000"/>
@@ -2792,9 +2768,9 @@
           <w:szCs w:val="22"/>
           <w:shd w:val="clear" w:color="auto" w:fill="FFFFFF"/>
         </w:rPr>
-        <w:t xml:space="preserve"> weakened by high inequality which is one of the highest in the world and relatively moderate concentration on all four social segments of HEART: Housing, Health, Energy and Education. This sure indicates that South Africa faces interconnected economic challenges, primarily defined by the “triple challenges” of high unemployment, poverty, and severe inequality. These issues are further compounded by low economic growth and </w:t>
-      </w:r>
-      <w:proofErr w:type="gramStart"/>
+        <w:t>governance related</w:t>
+      </w:r>
+      <w:proofErr w:type="gramEnd"/>
       <w:r>
         <w:rPr>
           <w:color w:val="000000"/>
@@ -2802,29 +2778,29 @@
           <w:szCs w:val="22"/>
           <w:shd w:val="clear" w:color="auto" w:fill="FFFFFF"/>
         </w:rPr>
-        <w:t>governance related</w:t>
-      </w:r>
-      <w:proofErr w:type="gramEnd"/>
-      <w:r>
+        <w:t xml:space="preserve"> matters.  </w:t>
+      </w:r>
+    </w:p>
+    <w:p>
+      <w:pPr>
+        <w:pStyle w:val="ListParagraph"/>
         <w:rPr>
           <w:color w:val="000000"/>
           <w:sz w:val="22"/>
           <w:szCs w:val="22"/>
           <w:shd w:val="clear" w:color="auto" w:fill="FFFFFF"/>
         </w:rPr>
-        <w:t xml:space="preserve"> matters.  </w:t>
-      </w:r>
-    </w:p>
-    <w:p>
-      <w:pPr>
-        <w:pStyle w:val="ListParagraph"/>
+      </w:pPr>
+      <w:r>
         <w:rPr>
           <w:color w:val="000000"/>
           <w:sz w:val="22"/>
           <w:szCs w:val="22"/>
           <w:shd w:val="clear" w:color="auto" w:fill="FFFFFF"/>
         </w:rPr>
-      </w:pPr>
+        <w:t xml:space="preserve">South Africa needs to enhance its economic growth faster than the population growth, seriously concentrate more on inequality and governance and turn the country into an inclusive lean economy to overcome some of the economic challenges at the short to medium term. Also, the country needs to address fiscal anchor, besides, expanding its strong export base. This is also worth mentioning that currently, South Africa does not enjoy good political, economic, and diplomatic relations with USA—the biggest economy of the world. In fact, US President had boycotted the recently concluded G-20 summit held in Saunth Africa from November 20th to 21 Novembr,2025 due to country’s alleged discrimination against its white citizens as what US President has claimed. The bilateral relations have further worsened when US President also made an announcement very recently that he will not invite South Africa to attend next year’s 2026 G-20 summit which is scheduled to be held in Miami USA. The ongoing trade war which USA has started with the entire world has further exacerbated South Africa’s problems. These are existential external economic challenges for which South Africa </w:t>
+      </w:r>
+      <w:proofErr w:type="gramStart"/>
       <w:r>
         <w:rPr>
           <w:color w:val="000000"/>
@@ -2832,9 +2808,9 @@
           <w:szCs w:val="22"/>
           <w:shd w:val="clear" w:color="auto" w:fill="FFFFFF"/>
         </w:rPr>
-        <w:t xml:space="preserve">South Africa needs to enhance its economic growth faster than the population growth, seriously concentrate more on inequality and governance and turn the country into an inclusive lean economy to overcome some of the economic challenges at the short to medium term. Also, the country needs to address fiscal anchor, besides, expanding its strong export base. This is also worth mentioning that currently, South Africa does not enjoy good political, economic, and diplomatic relations with USA—the biggest economy of the world. In fact, US President had boycotted the recently concluded G-20 summit held in Saunth Africa from November 20th to 21 Novembr,2025 due to country’s alleged discrimination against its white citizens as what US President has claimed. The bilateral relations have further worsened when US President also made an announcement very recently that he will not invite South Africa to attend next year’s 2026 G-20 summit which is scheduled to be held in Miami USA. The ongoing trade war which USA has started with the entire world has further exacerbated South Africa’s problems. These are existential external economic challenges for which South Africa </w:t>
-      </w:r>
-      <w:proofErr w:type="gramStart"/>
+        <w:t>need</w:t>
+      </w:r>
+      <w:proofErr w:type="gramEnd"/>
       <w:r>
         <w:rPr>
           <w:color w:val="000000"/>
@@ -2842,16 +2818,6 @@
           <w:szCs w:val="22"/>
           <w:shd w:val="clear" w:color="auto" w:fill="FFFFFF"/>
         </w:rPr>
-        <w:t>need</w:t>
-      </w:r>
-      <w:proofErr w:type="gramEnd"/>
-      <w:r>
-        <w:rPr>
-          <w:color w:val="000000"/>
-          <w:sz w:val="22"/>
-          <w:szCs w:val="22"/>
-          <w:shd w:val="clear" w:color="auto" w:fill="FFFFFF"/>
-        </w:rPr>
         <w:t xml:space="preserve"> to tackle through economic diplomacy and national resolve.</w:t>
       </w:r>
     </w:p>
@@ -3077,7 +3043,10 @@
         <w:ind w:left="720"/>
       </w:pPr>
       <w:r>
-        <w:t>Brazil – Heart Value: 0.44 | Heart Affordability Value: $28,530+ | Heart Affordability Ranking: B → Heart Score: 0.44B.</w:t>
+        <w:t>France</w:t>
+      </w:r>
+      <w:r>
+        <w:t xml:space="preserve"> – Heart Value: 0.44 | Heart Affordability Value: $28,530+ | Heart Affordability Ranking: B → Heart Score: 0.44B.</w:t>
       </w:r>
     </w:p>
     <w:p>
@@ -3792,7 +3761,22 @@
         <w:ind w:left="720"/>
       </w:pPr>
       <w:r>
-        <w:t>Brazil – Heart Value: 0.38 | Heart Affordability Value: $32,140+ | Heart Affordability Ranking: B+ → Heart Score: 0.38B+.</w:t>
+        <w:t>United Kingdom</w:t>
+      </w:r>
+      <w:r>
+        <w:t xml:space="preserve"> – Heart Value: 0.3</w:t>
+      </w:r>
+      <w:r>
+        <w:t>9</w:t>
+      </w:r>
+      <w:r>
+        <w:t xml:space="preserve"> | Heart Affordability Value: $32,140+ | Heart Affordability Ranking: B+ → Heart Score: 0.3</w:t>
+      </w:r>
+      <w:r>
+        <w:t>9</w:t>
+      </w:r>
+      <w:r>
+        <w:t>B+.</w:t>
       </w:r>
     </w:p>
     <w:p>

</xml_diff>